<commit_message>
Align Supplementary Table S2 action terminology
Update three output labels to match the manuscript's runtime action definitions. Data, calculations, code and all other supplementary files are unchanged.
</commit_message>
<xml_diff>
--- a/supplementary-material/Supplementary Table S2.docx
+++ b/supplementary-material/Supplementary Table S2.docx
@@ -596,15 +596,15 @@
                 <w:sz w:val="20"/>
                 <w:szCs w:val="20"/>
               </w:rPr>
-              <w:t xml:space="preserve">P2 </w:t>
-            </w:r>
-            <w:r>
-              <w:rPr>
-                <w:rFonts w:ascii="Times New Roman" w:eastAsia="DengXian" w:hAnsi="Times New Roman" w:cs="Times New Roman"/>
-                <w:sz w:val="20"/>
-                <w:szCs w:val="20"/>
-              </w:rPr>
-              <w:t>runtime push frequency</w:t>
+              <w:t>P2 runtime action frequenc</w:t>
+            </w:r>
+            <w:r>
+              <w:rPr>
+                <w:rFonts w:ascii="Times New Roman" w:eastAsia="DengXian" w:hAnsi="Times New Roman" w:cs="Times New Roman"/>
+                <w:sz w:val="20"/>
+                <w:szCs w:val="20"/>
+              </w:rPr>
+              <w:t>y</w:t>
             </w:r>
           </w:p>
           <w:p>
@@ -834,19 +834,19 @@
             </w:pPr>
             <w:r>
               <w:rPr>
-                <w:rFonts w:ascii="Times New Roman" w:eastAsia="DengXian" w:hAnsi="Times New Roman" w:cs="Times New Roman" w:hint="eastAsia"/>
-                <w:sz w:val="20"/>
-                <w:szCs w:val="20"/>
-              </w:rPr>
-              <w:t>P2 r</w:t>
-            </w:r>
-            <w:r>
-              <w:rPr>
-                <w:rFonts w:ascii="Times New Roman" w:eastAsia="DengXian" w:hAnsi="Times New Roman" w:cs="Times New Roman"/>
-                <w:sz w:val="20"/>
-                <w:szCs w:val="20"/>
-              </w:rPr>
-              <w:t>ecorded push-action count</w:t>
+                <w:rFonts w:ascii="Times New Roman" w:eastAsia="DengXian" w:hAnsi="Times New Roman" w:cs="Times New Roman"/>
+                <w:sz w:val="20"/>
+                <w:szCs w:val="20"/>
+              </w:rPr>
+              <w:t>P2 runtime-recorded action coun</w:t>
+            </w:r>
+            <w:r>
+              <w:rPr>
+                <w:rFonts w:ascii="Times New Roman" w:eastAsia="DengXian" w:hAnsi="Times New Roman" w:cs="Times New Roman"/>
+                <w:sz w:val="20"/>
+                <w:szCs w:val="20"/>
+              </w:rPr>
+              <w:t>t</w:t>
             </w:r>
           </w:p>
           <w:p>
@@ -1515,23 +1515,15 @@
                 <w:sz w:val="20"/>
                 <w:szCs w:val="20"/>
               </w:rPr>
-              <w:t xml:space="preserve">P2 </w:t>
-            </w:r>
-            <w:r>
-              <w:rPr>
-                <w:rFonts w:ascii="Times New Roman" w:eastAsia="DengXian" w:hAnsi="Times New Roman" w:cs="Times New Roman"/>
-                <w:sz w:val="20"/>
-                <w:szCs w:val="20"/>
-              </w:rPr>
-              <w:t xml:space="preserve">bilateral </w:t>
-            </w:r>
-            <w:r>
-              <w:rPr>
-                <w:rFonts w:ascii="Times New Roman" w:eastAsia="DengXian" w:hAnsi="Times New Roman" w:cs="Times New Roman"/>
-                <w:sz w:val="20"/>
-                <w:szCs w:val="20"/>
-              </w:rPr>
-              <w:t>push-action duration SD/CV</w:t>
+              <w:t>P2 bilateral action duration SD/C</w:t>
+            </w:r>
+            <w:r>
+              <w:rPr>
+                <w:rFonts w:ascii="Times New Roman" w:eastAsia="DengXian" w:hAnsi="Times New Roman" w:cs="Times New Roman"/>
+                <w:sz w:val="20"/>
+                <w:szCs w:val="20"/>
+              </w:rPr>
+              <w:t>V</w:t>
             </w:r>
           </w:p>
           <w:p>

</xml_diff>